<commit_message>
Add Ticket entity and H2 database
</commit_message>
<xml_diff>
--- a/3/Прилуцкий-ВО_ИС-2б_Работа-3_Отчёт.docx
+++ b/3/Прилуцкий-ВО_ИС-2б_Работа-3_Отчёт.docx
@@ -1589,7 +1589,7 @@
                 <w:color w:val="666666"/>
                 <w:sz w:val="20"/>
               </w:rPr>
-              <w:t>https://github.com/username/help-desk</w:t>
+              <w:t>https://github.com/Scammer-programmer/Learning_java-OOP</w:t>
             </w:r>
           </w:p>
         </w:tc>
@@ -1658,7 +1658,7 @@
                 <w:color w:val="666666"/>
                 <w:sz w:val="20"/>
               </w:rPr>
-              <w:t>Например: main</w:t>
+              <w:t>main</w:t>
             </w:r>
           </w:p>
         </w:tc>
@@ -1786,7 +1786,9 @@
             <w:pPr>
               <w:pStyle w:val="Normal"/>
               <w:spacing w:lineRule="auto" w:line="252" w:before="0" w:after="40"/>
-              <w:rPr/>
+              <w:rPr>
+                <w:lang w:val="ru-RU"/>
+              </w:rPr>
             </w:pPr>
             <w:r>
               <w:rPr>
@@ -1795,8 +1797,9 @@
                 <w:i/>
                 <w:color w:val="666666"/>
                 <w:sz w:val="20"/>
-              </w:rPr>
-              <w:t>Публичный / приватный, доступ преподавателю выдан</w:t>
+                <w:lang w:val="ru-RU"/>
+              </w:rPr>
+              <w:t>Публичный</w:t>
             </w:r>
           </w:p>
         </w:tc>

</xml_diff>